<commit_message>
CV: add German A2, fix Nexora date wrapping, standardize project header formatting
</commit_message>
<xml_diff>
--- a/assets/pdfs/Mahmoud Fahmy.docx
+++ b/assets/pdfs/Mahmoud Fahmy.docx
@@ -2211,7 +2211,6 @@
       </w:r>
       <w:r>
         <w:rPr>
-          <w:b/>
           <w:bCs/>
           <w:w w:val="120"/>
         </w:rPr>
@@ -2521,7 +2520,6 @@
       </w:r>
       <w:r>
         <w:rPr>
-          <w:b/>
           <w:w w:val="115"/>
           <w:sz w:val="20"/>
         </w:rPr>
@@ -2964,6 +2962,7 @@
           <w:w w:val="115"/>
           <w:sz w:val="24"/>
           <w:szCs w:val="24"/>
+          <w:b/>
         </w:rPr>
         <w:t>SoundOra</w:t>
       </w:r>
@@ -3070,6 +3069,7 @@
       <w:r>
         <w:rPr>
           <w:w w:val="110"/>
+          <w:b/>
         </w:rPr>
         <w:t>Oct 2025 – Feb 2026</w:t>
       </w:r>
@@ -3258,6 +3258,7 @@
           <w:w w:val="115"/>
           <w:sz w:val="24"/>
           <w:szCs w:val="24"/>
+          <w:b/>
         </w:rPr>
         <w:t>Nexora</w:t>
       </w:r>
@@ -3350,8 +3351,9 @@
       <w:r>
         <w:rPr>
           <w:w w:val="110"/>
-        </w:rPr>
-        <w:t>Sep 2025 – Present</w:t>
+          <w:b/>
+        </w:rPr>
+        <w:t>Sep 2025 – Present</w:t>
       </w:r>
     </w:p>
     <w:p>
@@ -3516,7 +3518,6 @@
       </w:r>
       <w:r>
         <w:rPr>
-          <w:b/>
           <w:w w:val="110"/>
           <w:sz w:val="20"/>
         </w:rPr>
@@ -3524,7 +3525,6 @@
       </w:r>
       <w:r>
         <w:rPr>
-          <w:b/>
           <w:spacing w:val="75"/>
           <w:w w:val="110"/>
           <w:sz w:val="20"/>
@@ -3533,7 +3533,6 @@
       </w:r>
       <w:r>
         <w:rPr>
-          <w:b/>
           <w:w w:val="110"/>
           <w:sz w:val="20"/>
         </w:rPr>
@@ -4599,6 +4598,48 @@
       <w:pgMar w:top="200" w:right="240" w:bottom="162" w:left="240" w:header="720" w:footer="720" w:gutter="0"/>
       <w:cols w:space="720"/>
     </w:sectPr>
+    <w:p>
+      <w:pPr>
+        <w:spacing w:before="25" w:after="9"/>
+        <w:ind w:left="216"/>
+        <w:rPr>
+          <w:sz w:val="20"/>
+        </w:rPr>
+      </w:pPr>
+      <w:r>
+        <w:rPr>
+          <w:b/>
+          <w:w w:val="115"/>
+          <w:sz w:val="20"/>
+        </w:rPr>
+        <w:t>German:</w:t>
+      </w:r>
+      <w:r>
+        <w:rPr>
+          <w:b/>
+          <w:spacing w:val="27"/>
+          <w:w w:val="115"/>
+          <w:sz w:val="20"/>
+        </w:rPr>
+        <w:t xml:space="preserve"> </w:t>
+      </w:r>
+      <w:r>
+        <w:rPr>
+          <w:spacing w:val="-4"/>
+          <w:w w:val="115"/>
+          <w:sz w:val="20"/>
+        </w:rPr>
+        <w:t>A</w:t>
+      </w:r>
+      <w:r>
+        <w:rPr>
+          <w:spacing w:val="-4"/>
+          <w:w w:val="115"/>
+          <w:sz w:val="20"/>
+        </w:rPr>
+        <w:t>2</w:t>
+      </w:r>
+    </w:p>
   </w:body>
 </w:document>
 </file>

</xml_diff>

<commit_message>
CV: fix misplaced Portfolio icon in contact header (inline before Portfolio link)
</commit_message>
<xml_diff>
--- a/assets/pdfs/Mahmoud Fahmy.docx
+++ b/assets/pdfs/Mahmoud Fahmy.docx
@@ -76,66 +76,6 @@
           <w:w w:val="110"/>
         </w:rPr>
       </w:pPr>
-      <w:r>
-        <w:rPr>
-          <w:noProof/>
-        </w:rPr>
-        <w:drawing>
-          <wp:anchor distT="0" distB="0" distL="114300" distR="114300" simplePos="0" relativeHeight="251657728" behindDoc="0" locked="0" layoutInCell="1" allowOverlap="1" wp14:anchorId="23A8BBE4" wp14:editId="38C5CBD7">
-            <wp:simplePos x="0" y="0"/>
-            <wp:positionH relativeFrom="column">
-              <wp:posOffset>5337810</wp:posOffset>
-            </wp:positionH>
-            <wp:positionV relativeFrom="page">
-              <wp:posOffset>1089545</wp:posOffset>
-            </wp:positionV>
-            <wp:extent cx="177800" cy="177800"/>
-            <wp:effectExtent l="0" t="0" r="0" b="0"/>
-            <wp:wrapNone/>
-            <wp:docPr id="2050025917" name="Graphic 8" descr="Employee badge with solid fill"/>
-            <wp:cNvGraphicFramePr>
-              <a:graphicFrameLocks xmlns:a="http://schemas.openxmlformats.org/drawingml/2006/main" noChangeAspect="1"/>
-            </wp:cNvGraphicFramePr>
-            <a:graphic xmlns:a="http://schemas.openxmlformats.org/drawingml/2006/main">
-              <a:graphicData uri="http://schemas.openxmlformats.org/drawingml/2006/picture">
-                <pic:pic xmlns:pic="http://schemas.openxmlformats.org/drawingml/2006/picture">
-                  <pic:nvPicPr>
-                    <pic:cNvPr id="2050025917" name="Graphic 2050025917" descr="Employee badge with solid fill"/>
-                    <pic:cNvPicPr/>
-                  </pic:nvPicPr>
-                  <pic:blipFill>
-                    <a:blip r:embed="rId7">
-                      <a:extLst>
-                        <a:ext uri="{96DAC541-7B7A-43D3-8B79-37D633B846F1}">
-                          <asvg:svgBlip xmlns:asvg="http://schemas.microsoft.com/office/drawing/2016/SVG/main" r:embed="rId8"/>
-                        </a:ext>
-                      </a:extLst>
-                    </a:blip>
-                    <a:stretch>
-                      <a:fillRect/>
-                    </a:stretch>
-                  </pic:blipFill>
-                  <pic:spPr>
-                    <a:xfrm rot="10800000" flipH="1" flipV="1">
-                      <a:off x="0" y="0"/>
-                      <a:ext cx="177800" cy="177800"/>
-                    </a:xfrm>
-                    <a:prstGeom prst="rect">
-                      <a:avLst/>
-                    </a:prstGeom>
-                  </pic:spPr>
-                </pic:pic>
-              </a:graphicData>
-            </a:graphic>
-            <wp14:sizeRelH relativeFrom="margin">
-              <wp14:pctWidth>0</wp14:pctWidth>
-            </wp14:sizeRelH>
-            <wp14:sizeRelV relativeFrom="margin">
-              <wp14:pctHeight>0</wp14:pctHeight>
-            </wp14:sizeRelV>
-          </wp:anchor>
-        </w:drawing>
-      </w:r>
       <w:r>
         <w:rPr>
           <w:w w:val="110"/>
@@ -217,10 +157,7 @@
         </w:drawing>
       </w:r>
       <w:r>
-        <w:rPr>
-          <w:rFonts w:ascii="Times New Roman"/>
-          <w:spacing w:val="24"/>
-        </w:rPr>
+        <w:rPr/>
         <w:t xml:space="preserve"> </w:t>
       </w:r>
       <w:r>
@@ -230,10 +167,8 @@
         <w:t>01013312546</w:t>
       </w:r>
       <w:r>
-        <w:rPr>
-          <w:spacing w:val="68"/>
-        </w:rPr>
-        <w:t xml:space="preserve">  </w:t>
+        <w:rPr/>
+        <w:t xml:space="preserve">   </w:t>
       </w:r>
       <w:r>
         <w:rPr>
@@ -278,10 +213,7 @@
         </w:drawing>
       </w:r>
       <w:r>
-        <w:rPr>
-          <w:rFonts w:ascii="Times New Roman"/>
-          <w:spacing w:val="3"/>
-        </w:rPr>
+        <w:rPr/>
         <w:t xml:space="preserve"> </w:t>
       </w:r>
       <w:hyperlink r:id="rId11" w:history="1">
@@ -311,16 +243,8 @@
         <w:t>@gmail.com</w:t>
       </w:r>
       <w:r>
-        <w:rPr>
-          <w:spacing w:val="68"/>
-        </w:rPr>
-        <w:t xml:space="preserve">  </w:t>
-      </w:r>
-      <w:r>
-        <w:rPr>
-          <w:spacing w:val="68"/>
-        </w:rPr>
-        <w:t xml:space="preserve">  </w:t>
+        <w:rPr/>
+        <w:t xml:space="preserve">   </w:t>
       </w:r>
       <w:r>
         <w:rPr>
@@ -365,10 +289,7 @@
         </w:drawing>
       </w:r>
       <w:r>
-        <w:rPr>
-          <w:rFonts w:ascii="Times New Roman"/>
-          <w:spacing w:val="3"/>
-        </w:rPr>
+        <w:rPr/>
         <w:t xml:space="preserve"> </w:t>
       </w:r>
       <w:hyperlink r:id="rId13">
@@ -380,7 +301,8 @@
         </w:r>
       </w:hyperlink>
       <w:r>
-        <w:t xml:space="preserve">       </w:t>
+        <w:rPr/>
+        <w:t xml:space="preserve">   </w:t>
       </w:r>
       <w:r>
         <w:rPr>
@@ -429,7 +351,8 @@
         </w:drawing>
       </w:r>
       <w:r>
-        <w:t xml:space="preserve">  </w:t>
+        <w:rPr/>
+        <w:t xml:space="preserve"> </w:t>
       </w:r>
       <w:hyperlink r:id="rId15">
         <w:r>
@@ -442,10 +365,56 @@
         </w:r>
       </w:hyperlink>
       <w:r>
-        <w:t xml:space="preserve"> </w:t>
-      </w:r>
-      <w:r>
-        <w:t xml:space="preserve">         </w:t>
+        <w:rPr/>
+        <w:t xml:space="preserve">   </w:t>
+      </w:r>
+      <w:r>
+        <w:rPr>
+          <w:noProof/>
+        </w:rPr>
+        <w:drawing>
+          <wp:inline distT="0" distB="0" distL="0" distR="0">
+            <wp:extent cx="120650" cy="120650"/>
+            <wp:effectExtent l="0" t="0" r="0" b="0"/>
+            <wp:docPr id="99" name="Image Portfolio"/>
+            <wp:cNvGraphicFramePr/>
+            <ns2:graphic xmlns:ns2="http://schemas.openxmlformats.org/drawingml/2006/main">
+              <ns2:graphicData uri="http://schemas.openxmlformats.org/drawingml/2006/picture">
+                <pic:pic xmlns:pic="http://schemas.openxmlformats.org/drawingml/2006/picture">
+                  <pic:nvPicPr>
+                    <pic:cNvPr id="2050025917" name="Graphic 2050025917" descr="Employee badge with solid fill"/>
+                    <pic:cNvPicPr/>
+                  </pic:nvPicPr>
+                  <pic:blipFill>
+                    <ns2:blip r:embed="rId7">
+                      <ns2:extLst>
+                        <ns2:ext uri="{96DAC541-7B7A-43D3-8B79-37D633B846F1}">
+                          <asvg:svgBlip xmlns:asvg="http://schemas.microsoft.com/office/drawing/2016/SVG/main" r:embed="rId8"/>
+                        </ns2:ext>
+                      </ns2:extLst>
+                    </ns2:blip>
+                    <ns2:stretch>
+                      <ns2:fillRect/>
+                    </ns2:stretch>
+                  </pic:blipFill>
+                  <pic:spPr>
+                    <ns2:xfrm>
+                      <ns2:off x="0" y="0"/>
+                      <ns2:ext cx="120650" cy="120650"/>
+                    </ns2:xfrm>
+                    <ns2:prstGeom prst="rect">
+                      <ns2:avLst/>
+                    </ns2:prstGeom>
+                  </pic:spPr>
+                </pic:pic>
+              </ns2:graphicData>
+            </ns2:graphic>
+          </wp:inline>
+        </w:drawing>
+      </w:r>
+      <w:r>
+        <w:rPr/>
+        <w:t xml:space="preserve"> </w:t>
       </w:r>
       <w:hyperlink r:id="rId16" w:history="1">
         <w:r>
@@ -457,15 +426,6 @@
           <w:t>Portfolio</w:t>
         </w:r>
       </w:hyperlink>
-      <w:r>
-        <w:t xml:space="preserve">     </w:t>
-      </w:r>
-      <w:r>
-        <w:t xml:space="preserve">    </w:t>
-      </w:r>
-      <w:r>
-        <w:tab/>
-      </w:r>
     </w:p>
     <w:p>
       <w:pPr>

</xml_diff>